<commit_message>
Title and subtitle fixed
</commit_message>
<xml_diff>
--- a/lease_template.docx
+++ b/lease_template.docx
@@ -103,259 +103,7 @@
           <w:shd w:fill="auto" w:val="clear"/>
           <w:vertAlign w:val="baseline"/>
         </w:rPr>
-        <w:t>THIS LEASE (the "Lease") dated [[</w:t>
-      </w:r>
-      <w:r>
-        <w:rPr>
-          <w:rFonts w:eastAsia="Times New Roman" w:cs="Times New Roman" w:ascii="Times New Roman" w:hAnsi="Times New Roman"/>
-          <w:b w:val="false"/>
-          <w:bCs w:val="false"/>
-          <w:i w:val="false"/>
-          <w:iCs w:val="false"/>
-          <w:caps w:val="false"/>
-          <w:smallCaps w:val="false"/>
-          <w:strike w:val="false"/>
-          <w:dstrike w:val="false"/>
-          <w:color w:val="000000"/>
-          <w:position w:val="0"/>
-          <w:sz w:val="24"/>
-          <w:szCs w:val="24"/>
-          <w:u w:val="none"/>
-          <w:shd w:fill="auto" w:val="clear"/>
-          <w:vertAlign w:val="baseline"/>
-        </w:rPr>
-        <w:t>L</w:t>
-      </w:r>
-      <w:r>
-        <w:rPr>
-          <w:rFonts w:eastAsia="Times New Roman" w:cs="Times New Roman" w:ascii="Times New Roman" w:hAnsi="Times New Roman"/>
-          <w:b w:val="false"/>
-          <w:bCs w:val="false"/>
-          <w:i w:val="false"/>
-          <w:iCs w:val="false"/>
-          <w:caps w:val="false"/>
-          <w:smallCaps w:val="false"/>
-          <w:strike w:val="false"/>
-          <w:dstrike w:val="false"/>
-          <w:color w:val="000000"/>
-          <w:position w:val="0"/>
-          <w:sz w:val="24"/>
-          <w:szCs w:val="24"/>
-          <w:u w:val="none"/>
-          <w:shd w:fill="auto" w:val="clear"/>
-          <w:vertAlign w:val="baseline"/>
-        </w:rPr>
-        <w:t>E</w:t>
-      </w:r>
-      <w:r>
-        <w:rPr>
-          <w:rFonts w:eastAsia="Times New Roman" w:cs="Times New Roman" w:ascii="Times New Roman" w:hAnsi="Times New Roman"/>
-          <w:b w:val="false"/>
-          <w:bCs w:val="false"/>
-          <w:i w:val="false"/>
-          <w:iCs w:val="false"/>
-          <w:caps w:val="false"/>
-          <w:smallCaps w:val="false"/>
-          <w:strike w:val="false"/>
-          <w:dstrike w:val="false"/>
-          <w:color w:val="000000"/>
-          <w:position w:val="0"/>
-          <w:sz w:val="24"/>
-          <w:szCs w:val="24"/>
-          <w:u w:val="none"/>
-          <w:shd w:fill="auto" w:val="clear"/>
-          <w:vertAlign w:val="baseline"/>
-        </w:rPr>
-        <w:t>A</w:t>
-      </w:r>
-      <w:r>
-        <w:rPr>
-          <w:rFonts w:eastAsia="Times New Roman" w:cs="Times New Roman" w:ascii="Times New Roman" w:hAnsi="Times New Roman"/>
-          <w:b w:val="false"/>
-          <w:bCs w:val="false"/>
-          <w:i w:val="false"/>
-          <w:iCs w:val="false"/>
-          <w:caps w:val="false"/>
-          <w:smallCaps w:val="false"/>
-          <w:strike w:val="false"/>
-          <w:dstrike w:val="false"/>
-          <w:color w:val="000000"/>
-          <w:position w:val="0"/>
-          <w:sz w:val="24"/>
-          <w:szCs w:val="24"/>
-          <w:u w:val="none"/>
-          <w:shd w:fill="auto" w:val="clear"/>
-          <w:vertAlign w:val="baseline"/>
-        </w:rPr>
-        <w:t>S</w:t>
-      </w:r>
-      <w:r>
-        <w:rPr>
-          <w:rFonts w:eastAsia="Times New Roman" w:cs="Times New Roman" w:ascii="Times New Roman" w:hAnsi="Times New Roman"/>
-          <w:b w:val="false"/>
-          <w:bCs w:val="false"/>
-          <w:i w:val="false"/>
-          <w:iCs w:val="false"/>
-          <w:caps w:val="false"/>
-          <w:smallCaps w:val="false"/>
-          <w:strike w:val="false"/>
-          <w:dstrike w:val="false"/>
-          <w:color w:val="000000"/>
-          <w:position w:val="0"/>
-          <w:sz w:val="24"/>
-          <w:szCs w:val="24"/>
-          <w:u w:val="none"/>
-          <w:shd w:fill="auto" w:val="clear"/>
-          <w:vertAlign w:val="baseline"/>
-        </w:rPr>
-        <w:t>E</w:t>
-      </w:r>
-      <w:r>
-        <w:rPr>
-          <w:rFonts w:eastAsia="Times New Roman" w:cs="Times New Roman" w:ascii="Times New Roman" w:hAnsi="Times New Roman"/>
-          <w:b w:val="false"/>
-          <w:bCs w:val="false"/>
-          <w:i w:val="false"/>
-          <w:iCs w:val="false"/>
-          <w:caps w:val="false"/>
-          <w:smallCaps w:val="false"/>
-          <w:strike w:val="false"/>
-          <w:dstrike w:val="false"/>
-          <w:color w:val="000000"/>
-          <w:position w:val="0"/>
-          <w:sz w:val="24"/>
-          <w:szCs w:val="24"/>
-          <w:u w:val="none"/>
-          <w:shd w:fill="auto" w:val="clear"/>
-          <w:vertAlign w:val="baseline"/>
-        </w:rPr>
-        <w:t>_</w:t>
-      </w:r>
-      <w:r>
-        <w:rPr>
-          <w:rFonts w:eastAsia="Times New Roman" w:cs="Times New Roman" w:ascii="Times New Roman" w:hAnsi="Times New Roman"/>
-          <w:b w:val="false"/>
-          <w:bCs w:val="false"/>
-          <w:i w:val="false"/>
-          <w:iCs w:val="false"/>
-          <w:caps w:val="false"/>
-          <w:smallCaps w:val="false"/>
-          <w:strike w:val="false"/>
-          <w:dstrike w:val="false"/>
-          <w:color w:val="000000"/>
-          <w:position w:val="0"/>
-          <w:sz w:val="24"/>
-          <w:szCs w:val="24"/>
-          <w:u w:val="none"/>
-          <w:shd w:fill="auto" w:val="clear"/>
-          <w:vertAlign w:val="baseline"/>
-        </w:rPr>
-        <w:t>S</w:t>
-      </w:r>
-      <w:r>
-        <w:rPr>
-          <w:rFonts w:eastAsia="Times New Roman" w:cs="Times New Roman" w:ascii="Times New Roman" w:hAnsi="Times New Roman"/>
-          <w:b w:val="false"/>
-          <w:bCs w:val="false"/>
-          <w:i w:val="false"/>
-          <w:iCs w:val="false"/>
-          <w:caps w:val="false"/>
-          <w:smallCaps w:val="false"/>
-          <w:strike w:val="false"/>
-          <w:dstrike w:val="false"/>
-          <w:color w:val="000000"/>
-          <w:position w:val="0"/>
-          <w:sz w:val="24"/>
-          <w:szCs w:val="24"/>
-          <w:u w:val="none"/>
-          <w:shd w:fill="auto" w:val="clear"/>
-          <w:vertAlign w:val="baseline"/>
-        </w:rPr>
-        <w:t>T</w:t>
-      </w:r>
-      <w:r>
-        <w:rPr>
-          <w:rFonts w:eastAsia="Times New Roman" w:cs="Times New Roman" w:ascii="Times New Roman" w:hAnsi="Times New Roman"/>
-          <w:b w:val="false"/>
-          <w:bCs w:val="false"/>
-          <w:i w:val="false"/>
-          <w:iCs w:val="false"/>
-          <w:caps w:val="false"/>
-          <w:smallCaps w:val="false"/>
-          <w:strike w:val="false"/>
-          <w:dstrike w:val="false"/>
-          <w:color w:val="000000"/>
-          <w:position w:val="0"/>
-          <w:sz w:val="24"/>
-          <w:szCs w:val="24"/>
-          <w:u w:val="none"/>
-          <w:shd w:fill="auto" w:val="clear"/>
-          <w:vertAlign w:val="baseline"/>
-        </w:rPr>
-        <w:t>A</w:t>
-      </w:r>
-      <w:r>
-        <w:rPr>
-          <w:rFonts w:eastAsia="Times New Roman" w:cs="Times New Roman" w:ascii="Times New Roman" w:hAnsi="Times New Roman"/>
-          <w:b w:val="false"/>
-          <w:bCs w:val="false"/>
-          <w:i w:val="false"/>
-          <w:iCs w:val="false"/>
-          <w:caps w:val="false"/>
-          <w:smallCaps w:val="false"/>
-          <w:strike w:val="false"/>
-          <w:dstrike w:val="false"/>
-          <w:color w:val="000000"/>
-          <w:position w:val="0"/>
-          <w:sz w:val="24"/>
-          <w:szCs w:val="24"/>
-          <w:u w:val="none"/>
-          <w:shd w:fill="auto" w:val="clear"/>
-          <w:vertAlign w:val="baseline"/>
-        </w:rPr>
-        <w:t>R</w:t>
-      </w:r>
-      <w:r>
-        <w:rPr>
-          <w:rFonts w:eastAsia="Times New Roman" w:cs="Times New Roman" w:ascii="Times New Roman" w:hAnsi="Times New Roman"/>
-          <w:b w:val="false"/>
-          <w:bCs w:val="false"/>
-          <w:i w:val="false"/>
-          <w:iCs w:val="false"/>
-          <w:caps w:val="false"/>
-          <w:smallCaps w:val="false"/>
-          <w:strike w:val="false"/>
-          <w:dstrike w:val="false"/>
-          <w:color w:val="000000"/>
-          <w:position w:val="0"/>
-          <w:sz w:val="24"/>
-          <w:szCs w:val="24"/>
-          <w:u w:val="none"/>
-          <w:shd w:fill="auto" w:val="clear"/>
-          <w:vertAlign w:val="baseline"/>
-        </w:rPr>
-        <w:t>T</w:t>
-      </w:r>
-      <w:r>
-        <w:rPr>
-          <w:rFonts w:eastAsia="Times New Roman" w:cs="Times New Roman" w:ascii="Times New Roman" w:hAnsi="Times New Roman"/>
-          <w:b w:val="false"/>
-          <w:bCs w:val="false"/>
-          <w:i w:val="false"/>
-          <w:iCs w:val="false"/>
-          <w:caps w:val="false"/>
-          <w:smallCaps w:val="false"/>
-          <w:strike w:val="false"/>
-          <w:dstrike w:val="false"/>
-          <w:color w:val="000000"/>
-          <w:position w:val="0"/>
-          <w:sz w:val="24"/>
-          <w:szCs w:val="24"/>
-          <w:u w:val="none"/>
-          <w:shd w:fill="auto" w:val="clear"/>
-          <w:vertAlign w:val="baseline"/>
-        </w:rPr>
-        <w:t>_</w:t>
+        <w:t>THIS LEASE (the "Lease") dated [[LEASE_START_</w:t>
       </w:r>
       <w:r>
         <w:rPr>
@@ -1762,154 +1510,7 @@
         </w:rPr>
         <w:t xml:space="preserve">11. </w:t>
         <w:tab/>
-        <w:t>Subject to the provisions of this Lease, the rent for the Property is [[RENT</w:t>
-      </w:r>
-      <w:r>
-        <w:rPr>
-          <w:rFonts w:eastAsia="Times New Roman" w:cs="Times New Roman" w:ascii="Times New Roman" w:hAnsi="Times New Roman"/>
-          <w:b w:val="false"/>
-          <w:bCs w:val="false"/>
-          <w:i w:val="false"/>
-          <w:iCs w:val="false"/>
-          <w:caps w:val="false"/>
-          <w:smallCaps w:val="false"/>
-          <w:strike w:val="false"/>
-          <w:dstrike w:val="false"/>
-          <w:color w:val="000000"/>
-          <w:position w:val="0"/>
-          <w:sz w:val="24"/>
-          <w:szCs w:val="24"/>
-          <w:u w:val="none"/>
-          <w:shd w:fill="auto" w:val="clear"/>
-          <w:vertAlign w:val="baseline"/>
-        </w:rPr>
-        <w:t>_</w:t>
-      </w:r>
-      <w:r>
-        <w:rPr>
-          <w:rFonts w:eastAsia="Times New Roman" w:cs="Times New Roman" w:ascii="Times New Roman" w:hAnsi="Times New Roman"/>
-          <w:b w:val="false"/>
-          <w:bCs w:val="false"/>
-          <w:i w:val="false"/>
-          <w:iCs w:val="false"/>
-          <w:caps w:val="false"/>
-          <w:smallCaps w:val="false"/>
-          <w:strike w:val="false"/>
-          <w:dstrike w:val="false"/>
-          <w:color w:val="000000"/>
-          <w:position w:val="0"/>
-          <w:sz w:val="24"/>
-          <w:szCs w:val="24"/>
-          <w:u w:val="none"/>
-          <w:shd w:fill="auto" w:val="clear"/>
-          <w:vertAlign w:val="baseline"/>
-        </w:rPr>
-        <w:t>P</w:t>
-      </w:r>
-      <w:r>
-        <w:rPr>
-          <w:rFonts w:eastAsia="Times New Roman" w:cs="Times New Roman" w:ascii="Times New Roman" w:hAnsi="Times New Roman"/>
-          <w:b w:val="false"/>
-          <w:bCs w:val="false"/>
-          <w:i w:val="false"/>
-          <w:iCs w:val="false"/>
-          <w:caps w:val="false"/>
-          <w:smallCaps w:val="false"/>
-          <w:strike w:val="false"/>
-          <w:dstrike w:val="false"/>
-          <w:color w:val="000000"/>
-          <w:position w:val="0"/>
-          <w:sz w:val="24"/>
-          <w:szCs w:val="24"/>
-          <w:u w:val="none"/>
-          <w:shd w:fill="auto" w:val="clear"/>
-          <w:vertAlign w:val="baseline"/>
-        </w:rPr>
-        <w:t>R</w:t>
-      </w:r>
-      <w:r>
-        <w:rPr>
-          <w:rFonts w:eastAsia="Times New Roman" w:cs="Times New Roman" w:ascii="Times New Roman" w:hAnsi="Times New Roman"/>
-          <w:b w:val="false"/>
-          <w:bCs w:val="false"/>
-          <w:i w:val="false"/>
-          <w:iCs w:val="false"/>
-          <w:caps w:val="false"/>
-          <w:smallCaps w:val="false"/>
-          <w:strike w:val="false"/>
-          <w:dstrike w:val="false"/>
-          <w:color w:val="000000"/>
-          <w:position w:val="0"/>
-          <w:sz w:val="24"/>
-          <w:szCs w:val="24"/>
-          <w:u w:val="none"/>
-          <w:shd w:fill="auto" w:val="clear"/>
-          <w:vertAlign w:val="baseline"/>
-        </w:rPr>
-        <w:t>I</w:t>
-      </w:r>
-      <w:r>
-        <w:rPr>
-          <w:rFonts w:eastAsia="Times New Roman" w:cs="Times New Roman" w:ascii="Times New Roman" w:hAnsi="Times New Roman"/>
-          <w:b w:val="false"/>
-          <w:bCs w:val="false"/>
-          <w:i w:val="false"/>
-          <w:iCs w:val="false"/>
-          <w:caps w:val="false"/>
-          <w:smallCaps w:val="false"/>
-          <w:strike w:val="false"/>
-          <w:dstrike w:val="false"/>
-          <w:color w:val="000000"/>
-          <w:position w:val="0"/>
-          <w:sz w:val="24"/>
-          <w:szCs w:val="24"/>
-          <w:u w:val="none"/>
-          <w:shd w:fill="auto" w:val="clear"/>
-          <w:vertAlign w:val="baseline"/>
-        </w:rPr>
-        <w:t>C</w:t>
-      </w:r>
-      <w:r>
-        <w:rPr>
-          <w:rFonts w:eastAsia="Times New Roman" w:cs="Times New Roman" w:ascii="Times New Roman" w:hAnsi="Times New Roman"/>
-          <w:b w:val="false"/>
-          <w:bCs w:val="false"/>
-          <w:i w:val="false"/>
-          <w:iCs w:val="false"/>
-          <w:caps w:val="false"/>
-          <w:smallCaps w:val="false"/>
-          <w:strike w:val="false"/>
-          <w:dstrike w:val="false"/>
-          <w:color w:val="000000"/>
-          <w:position w:val="0"/>
-          <w:sz w:val="24"/>
-          <w:szCs w:val="24"/>
-          <w:u w:val="none"/>
-          <w:shd w:fill="auto" w:val="clear"/>
-          <w:vertAlign w:val="baseline"/>
-        </w:rPr>
-        <w:t>E</w:t>
-      </w:r>
-      <w:r>
-        <w:rPr>
-          <w:rFonts w:eastAsia="Times New Roman" w:cs="Times New Roman" w:ascii="Times New Roman" w:hAnsi="Times New Roman"/>
-          <w:b w:val="false"/>
-          <w:bCs w:val="false"/>
-          <w:i w:val="false"/>
-          <w:iCs w:val="false"/>
-          <w:caps w:val="false"/>
-          <w:smallCaps w:val="false"/>
-          <w:strike w:val="false"/>
-          <w:dstrike w:val="false"/>
-          <w:color w:val="000000"/>
-          <w:position w:val="0"/>
-          <w:sz w:val="24"/>
-          <w:szCs w:val="24"/>
-          <w:u w:val="none"/>
-          <w:shd w:fill="auto" w:val="clear"/>
-          <w:vertAlign w:val="baseline"/>
-        </w:rPr>
-        <w:t xml:space="preserve">]] per month (the "Rent"). </w:t>
+        <w:t xml:space="preserve">Subject to the provisions of this Lease, the rent for the Property is [[RENT_PRICE]] per month (the "Rent"). </w:t>
       </w:r>
     </w:p>
     <w:p>
@@ -6391,28 +5992,7 @@
           <w:shd w:fill="auto" w:val="clear"/>
           <w:vertAlign w:val="baseline"/>
         </w:rPr>
-        <w:t xml:space="preserve"> and [[LANDLORD_NAME]] have duly affixed their signatures on [[</w:t>
-      </w:r>
-      <w:r>
-        <w:rPr>
-          <w:rFonts w:eastAsia="Times New Roman" w:cs="Times New Roman" w:ascii="Times New Roman" w:hAnsi="Times New Roman"/>
-          <w:b w:val="false"/>
-          <w:bCs w:val="false"/>
-          <w:i w:val="false"/>
-          <w:iCs w:val="false"/>
-          <w:caps w:val="false"/>
-          <w:smallCaps w:val="false"/>
-          <w:strike w:val="false"/>
-          <w:dstrike w:val="false"/>
-          <w:color w:val="000000"/>
-          <w:position w:val="0"/>
-          <w:sz w:val="24"/>
-          <w:szCs w:val="24"/>
-          <w:u w:val="none"/>
-          <w:shd w:fill="auto" w:val="clear"/>
-          <w:vertAlign w:val="baseline"/>
-        </w:rPr>
-        <w:t>LEASE_START_</w:t>
+        <w:t xml:space="preserve"> and [[LANDLORD_NAME]] have duly affixed their signatures on [[LEASE_START_</w:t>
       </w:r>
       <w:r>
         <w:rPr>
@@ -7470,28 +7050,7 @@
           <w:shd w:fill="auto" w:val="clear"/>
           <w:vertAlign w:val="baseline"/>
         </w:rPr>
-        <w:t>Date:[[</w:t>
-      </w:r>
-      <w:r>
-        <w:rPr>
-          <w:rFonts w:eastAsia="Times New Roman" w:cs="Times New Roman" w:ascii="Times New Roman" w:hAnsi="Times New Roman"/>
-          <w:b w:val="false"/>
-          <w:bCs w:val="false"/>
-          <w:i w:val="false"/>
-          <w:iCs w:val="false"/>
-          <w:caps w:val="false"/>
-          <w:smallCaps w:val="false"/>
-          <w:strike w:val="false"/>
-          <w:dstrike w:val="false"/>
-          <w:color w:val="000000"/>
-          <w:position w:val="0"/>
-          <w:sz w:val="24"/>
-          <w:szCs w:val="24"/>
-          <w:u w:val="none"/>
-          <w:shd w:fill="auto" w:val="clear"/>
-          <w:vertAlign w:val="baseline"/>
-        </w:rPr>
-        <w:t>LEASE_START_</w:t>
+        <w:t>Date:[[LEASE_START_</w:t>
       </w:r>
       <w:r>
         <w:rPr>
@@ -8393,7 +7952,175 @@
           <w:shd w:fill="auto" w:val="clear"/>
           <w:vertAlign w:val="baseline"/>
         </w:rPr>
-        <w:t>Property: [[ADDRESS]]</w:t>
+        <w:t>Property: [[</w:t>
+      </w:r>
+      <w:r>
+        <w:rPr>
+          <w:rFonts w:eastAsia="Times New Roman" w:cs="Times New Roman" w:ascii="Times New Roman" w:hAnsi="Times New Roman"/>
+          <w:b w:val="false"/>
+          <w:bCs w:val="false"/>
+          <w:i w:val="false"/>
+          <w:iCs w:val="false"/>
+          <w:caps w:val="false"/>
+          <w:smallCaps w:val="false"/>
+          <w:strike w:val="false"/>
+          <w:dstrike w:val="false"/>
+          <w:color w:val="000000"/>
+          <w:position w:val="0"/>
+          <w:sz w:val="24"/>
+          <w:szCs w:val="24"/>
+          <w:u w:val="none"/>
+          <w:shd w:fill="auto" w:val="clear"/>
+          <w:vertAlign w:val="baseline"/>
+        </w:rPr>
+        <w:t>R</w:t>
+      </w:r>
+      <w:r>
+        <w:rPr>
+          <w:rFonts w:eastAsia="Times New Roman" w:cs="Times New Roman" w:ascii="Times New Roman" w:hAnsi="Times New Roman"/>
+          <w:b w:val="false"/>
+          <w:bCs w:val="false"/>
+          <w:i w:val="false"/>
+          <w:iCs w:val="false"/>
+          <w:caps w:val="false"/>
+          <w:smallCaps w:val="false"/>
+          <w:strike w:val="false"/>
+          <w:dstrike w:val="false"/>
+          <w:color w:val="000000"/>
+          <w:position w:val="0"/>
+          <w:sz w:val="24"/>
+          <w:szCs w:val="24"/>
+          <w:u w:val="none"/>
+          <w:shd w:fill="auto" w:val="clear"/>
+          <w:vertAlign w:val="baseline"/>
+        </w:rPr>
+        <w:t>E</w:t>
+      </w:r>
+      <w:r>
+        <w:rPr>
+          <w:rFonts w:eastAsia="Times New Roman" w:cs="Times New Roman" w:ascii="Times New Roman" w:hAnsi="Times New Roman"/>
+          <w:b w:val="false"/>
+          <w:bCs w:val="false"/>
+          <w:i w:val="false"/>
+          <w:iCs w:val="false"/>
+          <w:caps w:val="false"/>
+          <w:smallCaps w:val="false"/>
+          <w:strike w:val="false"/>
+          <w:dstrike w:val="false"/>
+          <w:color w:val="000000"/>
+          <w:position w:val="0"/>
+          <w:sz w:val="24"/>
+          <w:szCs w:val="24"/>
+          <w:u w:val="none"/>
+          <w:shd w:fill="auto" w:val="clear"/>
+          <w:vertAlign w:val="baseline"/>
+        </w:rPr>
+        <w:t>N</w:t>
+      </w:r>
+      <w:r>
+        <w:rPr>
+          <w:rFonts w:eastAsia="Times New Roman" w:cs="Times New Roman" w:ascii="Times New Roman" w:hAnsi="Times New Roman"/>
+          <w:b w:val="false"/>
+          <w:bCs w:val="false"/>
+          <w:i w:val="false"/>
+          <w:iCs w:val="false"/>
+          <w:caps w:val="false"/>
+          <w:smallCaps w:val="false"/>
+          <w:strike w:val="false"/>
+          <w:dstrike w:val="false"/>
+          <w:color w:val="000000"/>
+          <w:position w:val="0"/>
+          <w:sz w:val="24"/>
+          <w:szCs w:val="24"/>
+          <w:u w:val="none"/>
+          <w:shd w:fill="auto" w:val="clear"/>
+          <w:vertAlign w:val="baseline"/>
+        </w:rPr>
+        <w:t>T</w:t>
+      </w:r>
+      <w:r>
+        <w:rPr>
+          <w:rFonts w:eastAsia="Times New Roman" w:cs="Times New Roman" w:ascii="Times New Roman" w:hAnsi="Times New Roman"/>
+          <w:b w:val="false"/>
+          <w:bCs w:val="false"/>
+          <w:i w:val="false"/>
+          <w:iCs w:val="false"/>
+          <w:caps w:val="false"/>
+          <w:smallCaps w:val="false"/>
+          <w:strike w:val="false"/>
+          <w:dstrike w:val="false"/>
+          <w:color w:val="000000"/>
+          <w:position w:val="0"/>
+          <w:sz w:val="24"/>
+          <w:szCs w:val="24"/>
+          <w:u w:val="none"/>
+          <w:shd w:fill="auto" w:val="clear"/>
+          <w:vertAlign w:val="baseline"/>
+        </w:rPr>
+        <w:t>A</w:t>
+      </w:r>
+      <w:r>
+        <w:rPr>
+          <w:rFonts w:eastAsia="Times New Roman" w:cs="Times New Roman" w:ascii="Times New Roman" w:hAnsi="Times New Roman"/>
+          <w:b w:val="false"/>
+          <w:bCs w:val="false"/>
+          <w:i w:val="false"/>
+          <w:iCs w:val="false"/>
+          <w:caps w:val="false"/>
+          <w:smallCaps w:val="false"/>
+          <w:strike w:val="false"/>
+          <w:dstrike w:val="false"/>
+          <w:color w:val="000000"/>
+          <w:position w:val="0"/>
+          <w:sz w:val="24"/>
+          <w:szCs w:val="24"/>
+          <w:u w:val="none"/>
+          <w:shd w:fill="auto" w:val="clear"/>
+          <w:vertAlign w:val="baseline"/>
+        </w:rPr>
+        <w:t>L</w:t>
+      </w:r>
+      <w:r>
+        <w:rPr>
+          <w:rFonts w:eastAsia="Times New Roman" w:cs="Times New Roman" w:ascii="Times New Roman" w:hAnsi="Times New Roman"/>
+          <w:b w:val="false"/>
+          <w:bCs w:val="false"/>
+          <w:i w:val="false"/>
+          <w:iCs w:val="false"/>
+          <w:caps w:val="false"/>
+          <w:smallCaps w:val="false"/>
+          <w:strike w:val="false"/>
+          <w:dstrike w:val="false"/>
+          <w:color w:val="000000"/>
+          <w:position w:val="0"/>
+          <w:sz w:val="24"/>
+          <w:szCs w:val="24"/>
+          <w:u w:val="none"/>
+          <w:shd w:fill="auto" w:val="clear"/>
+          <w:vertAlign w:val="baseline"/>
+        </w:rPr>
+        <w:t>_</w:t>
+      </w:r>
+      <w:r>
+        <w:rPr>
+          <w:rFonts w:eastAsia="Times New Roman" w:cs="Times New Roman" w:ascii="Times New Roman" w:hAnsi="Times New Roman"/>
+          <w:b w:val="false"/>
+          <w:bCs w:val="false"/>
+          <w:i w:val="false"/>
+          <w:iCs w:val="false"/>
+          <w:caps w:val="false"/>
+          <w:smallCaps w:val="false"/>
+          <w:strike w:val="false"/>
+          <w:dstrike w:val="false"/>
+          <w:color w:val="000000"/>
+          <w:position w:val="0"/>
+          <w:sz w:val="24"/>
+          <w:szCs w:val="24"/>
+          <w:u w:val="none"/>
+          <w:shd w:fill="auto" w:val="clear"/>
+          <w:vertAlign w:val="baseline"/>
+        </w:rPr>
+        <w:t>ADDRESS]]</w:t>
       </w:r>
       <w:r>
         <w:rPr>
@@ -9282,7 +9009,7 @@
         <w:shd w:fill="auto" w:val="clear"/>
         <w:vertAlign w:val="baseline"/>
       </w:rPr>
-      <w:t>5</w:t>
+      <w:t>7</w:t>
     </w:r>
     <w:r>
       <w:rPr>
@@ -9399,7 +9126,7 @@
         <w:shd w:fill="auto" w:val="clear"/>
         <w:vertAlign w:val="baseline"/>
       </w:rPr>
-      <w:t>5</w:t>
+      <w:t>7</w:t>
     </w:r>
     <w:r>
       <w:rPr>

</xml_diff>